<commit_message>
perbaiki screenshot task II yang kosong, capture ulang dan bangun ulang laporan
</commit_message>
<xml_diff>
--- a/2026-09-07-modul-1/laporan/Laporan-Modul1_Ghaisan-Khoirul-Badruzaman_251524048_2BD4.docx
+++ b/2026-09-07-modul-1/laporan/Laporan-Modul1_Ghaisan-Khoirul-Badruzaman_251524048_2BD4.docx
@@ -3775,7 +3775,7 @@
       <w:r>
         <w:drawing>
           <wp:inline xmlns:a="http://schemas.openxmlformats.org/drawingml/2006/main" xmlns:pic="http://schemas.openxmlformats.org/drawingml/2006/picture">
-            <wp:extent cx="5943600" cy="4051300"/>
+            <wp:extent cx="5943600" cy="3664870"/>
             <wp:docPr id="7" name="Picture 7"/>
             <wp:cNvGraphicFramePr>
               <a:graphicFrameLocks noChangeAspect="1"/>
@@ -3796,7 +3796,7 @@
                   <pic:spPr>
                     <a:xfrm>
                       <a:off x="0" y="0"/>
-                      <a:ext cx="5943600" cy="4051300"/>
+                      <a:ext cx="5943600" cy="3664870"/>
                     </a:xfrm>
                     <a:prstGeom prst="rect"/>
                   </pic:spPr>

</xml_diff>